<commit_message>
feature/editing docx file + filling with parser from form
</commit_message>
<xml_diff>
--- a/converted_files/template.docx
+++ b/converted_files/template.docx
@@ -2,555 +2,314 @@
 <file path=word/document.xml><?xml version="1.0" encoding="utf-8"?>
 <w:document xmlns:wpc="http://schemas.microsoft.com/office/word/2010/wordprocessingCanvas" xmlns:cx="http://schemas.microsoft.com/office/drawing/2014/chartex" xmlns:cx1="http://schemas.microsoft.com/office/drawing/2015/9/8/chartex" xmlns:cx2="http://schemas.microsoft.com/office/drawing/2015/10/21/chartex" xmlns:cx3="http://schemas.microsoft.com/office/drawing/2016/5/9/chartex" xmlns:cx4="http://schemas.microsoft.com/office/drawing/2016/5/10/chartex" xmlns:cx5="http://schemas.microsoft.com/office/drawing/2016/5/11/chartex" xmlns:cx6="http://schemas.microsoft.com/office/drawing/2016/5/12/chartex" xmlns:cx7="http://schemas.microsoft.com/office/drawing/2016/5/13/chartex" xmlns:cx8="http://schemas.microsoft.com/office/drawing/2016/5/14/chartex" xmlns:mc="http://schemas.openxmlformats.org/markup-compatibility/2006" xmlns:aink="http://schemas.microsoft.com/office/drawing/2016/ink" xmlns:am3d="http://schemas.microsoft.com/office/drawing/2017/model3d" xmlns:o="urn:schemas-microsoft-com:office:office" xmlns:oel="http://schemas.microsoft.com/office/2019/extlst" xmlns:r="http://schemas.openxmlformats.org/officeDocument/2006/relationships" xmlns:m="http://schemas.openxmlformats.org/officeDocument/2006/math" xmlns:v="urn:schemas-microsoft-com:vml" xmlns:wp14="http://schemas.microsoft.com/office/word/2010/wordprocessingDrawing" xmlns:wp="http://schemas.openxmlformats.org/drawingml/2006/wordprocessingDrawing" xmlns:w10="urn:schemas-microsoft-com:office:word" xmlns:w="http://schemas.openxmlformats.org/wordprocessingml/2006/main" xmlns:w14="http://schemas.microsoft.com/office/word/2010/wordml" xmlns:w15="http://schemas.microsoft.com/office/word/2012/wordml" xmlns:w16cex="http://schemas.microsoft.com/office/word/2018/wordml/cex" xmlns:w16cid="http://schemas.microsoft.com/office/word/2016/wordml/cid" xmlns:w16="http://schemas.microsoft.com/office/word/2018/wordml" xmlns:w16du="http://schemas.microsoft.com/office/word/2023/wordml/word16du" xmlns:w16sdtdh="http://schemas.microsoft.com/office/word/2020/wordml/sdtdatahash" xmlns:w16sdtfl="http://schemas.microsoft.com/office/word/2024/wordml/sdtformatlock" xmlns:w16se="http://schemas.microsoft.com/office/word/2015/wordml/symex" xmlns:wpg="http://schemas.microsoft.com/office/word/2010/wordprocessingGroup" xmlns:wpi="http://schemas.microsoft.com/office/word/2010/wordprocessingInk" xmlns:wne="http://schemas.microsoft.com/office/word/2006/wordml" xmlns:wps="http://schemas.microsoft.com/office/word/2010/wordprocessingShape" mc:Ignorable="w14 w15 w16se w16cid w16 w16cex w16sdtdh w16sdtfl w16du wp14">
   <w:body>
-    <w:p>
-      <w:pPr>
-        <w:spacing w:after="120"/>
-        <w:ind w:left="142" w:hanging="142"/>
-      </w:pPr>
-      <w:r>
-        <w:rPr>
-          <w:noProof/>
-        </w:rPr>
-        <mc:AlternateContent>
-          <mc:Choice Requires="wps">
-            <w:drawing>
-              <wp:anchor distT="0" distB="0" distL="114300" distR="114300" simplePos="0" relativeHeight="251655679" behindDoc="0" locked="0" layoutInCell="1" allowOverlap="1" wp14:anchorId="119A1C16" wp14:editId="17ADCF8B">
-                <wp:simplePos x="0" y="0"/>
-                <wp:positionH relativeFrom="margin">
-                  <wp:posOffset>3604260</wp:posOffset>
-                </wp:positionH>
-                <wp:positionV relativeFrom="paragraph">
-                  <wp:posOffset>432435</wp:posOffset>
-                </wp:positionV>
-                <wp:extent cx="2973705" cy="2466975"/>
-                <wp:effectExtent l="0" t="0" r="0" b="9525"/>
-                <wp:wrapNone/>
-                <wp:docPr id="1960751003" name="Надпись 3"/>
-                <wp:cNvGraphicFramePr/>
-                <a:graphic xmlns:a="http://schemas.openxmlformats.org/drawingml/2006/main">
-                  <a:graphicData uri="http://schemas.microsoft.com/office/word/2010/wordprocessingShape">
-                    <wps:wsp>
-                      <wps:cNvSpPr txBox="1"/>
-                      <wps:spPr>
-                        <a:xfrm>
-                          <a:off x="0" y="0"/>
-                          <a:ext cx="2973705" cy="2466975"/>
-                        </a:xfrm>
-                        <a:prstGeom prst="rect">
-                          <a:avLst/>
-                        </a:prstGeom>
-                        <a:solidFill>
-                          <a:schemeClr val="lt1"/>
-                        </a:solidFill>
-                        <a:ln w="6350">
-                          <a:noFill/>
-                        </a:ln>
-                      </wps:spPr>
-                      <wps:txbx>
-                        <w:txbxContent>
-                          <w:p>
-                            <w:pPr>
-                              <w:rPr>
-                                <w:b/>
-                              </w:rPr>
-                            </w:pPr>
-                          </w:p>
-                          <w:p>
-                            <w:pPr>
-                              <w:jc w:val="center"/>
-                              <w:rPr>
-                                <w:b/>
-                                <w:sz w:val="22"/>
-                              </w:rPr>
-                            </w:pPr>
-                            <w:r>
-                              <w:rPr>
-                                <w:b/>
-                                <w:sz w:val="22"/>
-                              </w:rPr>
-                              <w:t>КОММЕРЧЕСКАЯ ТАЙНА</w:t>
-                            </w:r>
-                          </w:p>
-                          <w:p>
-                            <w:pPr>
-                              <w:jc w:val="center"/>
-                              <w:rPr>
-                                <w:b/>
-                                <w:sz w:val="22"/>
-                              </w:rPr>
-                            </w:pPr>
-                            <w:r>
-                              <w:rPr>
-                                <w:b/>
-                                <w:sz w:val="22"/>
-                              </w:rPr>
-                              <w:t xml:space="preserve">(без приложения </w:t>
-                            </w:r>
-                            <w:proofErr w:type="spellStart"/>
-                            <w:r>
-                              <w:rPr>
-                                <w:b/>
-                                <w:sz w:val="22"/>
-                              </w:rPr>
-                              <w:t>неконфиденциально</w:t>
-                            </w:r>
-                            <w:proofErr w:type="spellEnd"/>
-                            <w:r>
-                              <w:rPr>
-                                <w:b/>
-                                <w:sz w:val="22"/>
-                              </w:rPr>
-                              <w:t>)</w:t>
-                            </w:r>
-                          </w:p>
-                          <w:p>
-                            <w:pPr>
-                              <w:pStyle w:val="2"/>
-                              <w:spacing w:before="0" w:after="0"/>
-                              <w:jc w:val="center"/>
-                              <w:rPr>
-                                <w:rFonts w:ascii="Times New Roman" w:hAnsi="Times New Roman"/>
-                                <w:b w:val="0"/>
-                                <w:i w:val="0"/>
-                                <w:sz w:val="18"/>
-                              </w:rPr>
-                            </w:pPr>
-                            <w:r>
-                              <w:rPr>
-                                <w:rFonts w:ascii="Times New Roman" w:hAnsi="Times New Roman"/>
-                                <w:b w:val="0"/>
-                                <w:i w:val="0"/>
-                                <w:sz w:val="18"/>
-                              </w:rPr>
-                              <w:t>Общество с ограниченной ответственностью «Уральский центр систем безопасности»</w:t>
-                            </w:r>
-                          </w:p>
-                          <w:p>
-                            <w:pPr>
-                              <w:pStyle w:val="2"/>
-                              <w:spacing w:before="0" w:after="0"/>
-                              <w:jc w:val="center"/>
-                              <w:rPr>
-                                <w:rFonts w:ascii="Times New Roman" w:hAnsi="Times New Roman"/>
-                                <w:b w:val="0"/>
-                                <w:i w:val="0"/>
-                                <w:sz w:val="18"/>
-                              </w:rPr>
-                            </w:pPr>
-                            <w:r>
-                              <w:rPr>
-                                <w:rFonts w:ascii="Times New Roman" w:hAnsi="Times New Roman"/>
-                                <w:b w:val="0"/>
-                                <w:i w:val="0"/>
-                                <w:sz w:val="18"/>
-                              </w:rPr>
-                              <w:t>ул. Ткачей, д. 6, Екатеринбург, 620100</w:t>
-                            </w:r>
-                          </w:p>
-                          <w:p>
-                            <w:pPr>
-                              <w:jc w:val="center"/>
-                              <w:rPr>
-                                <w:b/>
-                                <w:sz w:val="22"/>
-                              </w:rPr>
-                            </w:pPr>
-                            <w:r>
-                              <w:rPr>
-                                <w:sz w:val="22"/>
-                              </w:rPr>
-                              <w:t>Экз. № __</w:t>
-                            </w:r>
-                          </w:p>
-                          <w:p>
-                            <w:pPr>
-                              <w:jc w:val="center"/>
-                              <w:rPr>
-                                <w:b/>
-                                <w:sz w:val="22"/>
-                              </w:rPr>
-                            </w:pPr>
-                          </w:p>
-                          <w:p>
-                            <w:pPr>
-                              <w:rPr>
-                                <w:b/>
-                                <w:lang w:eastAsia="en-US"/>
-                              </w:rPr>
-                            </w:pPr>
-                            <w:r>
-                              <w:rPr>
-                                <w:b/>
-                                <w:lang w:eastAsia="en-US"/>
-                              </w:rPr>
-                              <w:t xml:space="preserve">Заместителю генерального директора ООО «Мяу </w:t>
-                            </w:r>
-                            <w:proofErr w:type="spellStart"/>
-                            <w:r>
-                              <w:rPr>
-                                <w:b/>
-                                <w:lang w:eastAsia="en-US"/>
-                              </w:rPr>
-                              <w:t>Кусь</w:t>
-                            </w:r>
-                            <w:proofErr w:type="spellEnd"/>
-                            <w:r>
-                              <w:rPr>
-                                <w:b/>
-                                <w:lang w:eastAsia="en-US"/>
-                              </w:rPr>
-                              <w:t xml:space="preserve">» </w:t>
-                            </w:r>
-                          </w:p>
-                          <w:p>
-                            <w:pPr>
-                              <w:rPr>
-                                <w:b/>
-                                <w:lang w:eastAsia="en-US"/>
-                              </w:rPr>
-                            </w:pPr>
-                          </w:p>
-                          <w:p>
-                            <w:pPr>
-                              <w:rPr>
-                                <w:b/>
-                                <w:lang w:eastAsia="en-US"/>
-                              </w:rPr>
-                            </w:pPr>
-                            <w:r>
-                              <w:rPr>
-                                <w:b/>
-                                <w:lang w:eastAsia="en-US"/>
-                              </w:rPr>
-                              <w:t xml:space="preserve">Иванов </w:t>
-                            </w:r>
-                            <w:proofErr w:type="gramStart"/>
-                            <w:r>
-                              <w:rPr>
-                                <w:b/>
-                                <w:lang w:eastAsia="en-US"/>
-                              </w:rPr>
-                              <w:t>И.И.</w:t>
-                            </w:r>
-                            <w:proofErr w:type="gramEnd"/>
-                          </w:p>
-                          <w:p>
-                            <w:pPr>
-                              <w:rPr>
-                                <w:lang w:val="en-US"/>
-                              </w:rPr>
-                            </w:pPr>
-                          </w:p>
-                        </w:txbxContent>
-                      </wps:txbx>
-                      <wps:bodyPr rot="0" spcFirstLastPara="0" vertOverflow="overflow" horzOverflow="overflow" vert="horz" wrap="square" lIns="91440" tIns="45720" rIns="91440" bIns="45720" numCol="1" spcCol="0" rtlCol="0" fromWordArt="0" anchor="t" anchorCtr="0" forceAA="0" compatLnSpc="1">
-                        <a:prstTxWarp prst="textNoShape">
-                          <a:avLst/>
-                        </a:prstTxWarp>
-                        <a:noAutofit/>
-                      </wps:bodyPr>
-                    </wps:wsp>
-                  </a:graphicData>
-                </a:graphic>
-                <wp14:sizeRelH relativeFrom="margin">
-                  <wp14:pctWidth>0</wp14:pctWidth>
-                </wp14:sizeRelH>
-                <wp14:sizeRelV relativeFrom="margin">
-                  <wp14:pctHeight>0</wp14:pctHeight>
-                </wp14:sizeRelV>
-              </wp:anchor>
-            </w:drawing>
-          </mc:Choice>
-          <mc:Fallback>
-            <w:pict>
-              <v:shapetype w14:anchorId="119A1C16" id="_x0000_t202" coordsize="21600,21600" o:spt="202" path="m,l,21600r21600,l21600,xe">
-                <v:stroke joinstyle="miter"/>
-                <v:path gradientshapeok="t" o:connecttype="rect"/>
-              </v:shapetype>
-              <v:shape id="Надпись 3" o:spid="_x0000_s1026" type="#_x0000_t202" style="position:absolute;left:0;text-align:left;margin-left:283.8pt;margin-top:34.05pt;width:234.15pt;height:194.25pt;z-index:251655679;visibility:visible;mso-wrap-style:square;mso-width-percent:0;mso-height-percent:0;mso-wrap-distance-left:9pt;mso-wrap-distance-top:0;mso-wrap-distance-right:9pt;mso-wrap-distance-bottom:0;mso-position-horizontal:absolute;mso-position-horizontal-relative:margin;mso-position-vertical:absolute;mso-position-vertical-relative:text;mso-width-percent:0;mso-height-percent:0;mso-width-relative:margin;mso-height-relative:margin;v-text-anchor:top" o:gfxdata="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" fillcolor="white [3201]" stroked="f" strokeweight=".5pt">
-                <v:textbox>
-                  <w:txbxContent>
-                    <w:p>
-                      <w:pPr>
-                        <w:rPr>
-                          <w:b/>
-                        </w:rPr>
-                      </w:pPr>
-                    </w:p>
-                    <w:p>
-                      <w:pPr>
-                        <w:jc w:val="center"/>
-                        <w:rPr>
-                          <w:b/>
-                          <w:sz w:val="22"/>
-                        </w:rPr>
-                      </w:pPr>
-                      <w:r>
-                        <w:rPr>
-                          <w:b/>
-                          <w:sz w:val="22"/>
-                        </w:rPr>
-                        <w:t>КОММЕРЧЕСКАЯ ТАЙНА</w:t>
-                      </w:r>
-                    </w:p>
-                    <w:p>
-                      <w:pPr>
-                        <w:jc w:val="center"/>
-                        <w:rPr>
-                          <w:b/>
-                          <w:sz w:val="22"/>
-                        </w:rPr>
-                      </w:pPr>
-                      <w:r>
-                        <w:rPr>
-                          <w:b/>
-                          <w:sz w:val="22"/>
-                        </w:rPr>
-                        <w:t xml:space="preserve">(без приложения </w:t>
-                      </w:r>
-                      <w:proofErr w:type="spellStart"/>
-                      <w:r>
-                        <w:rPr>
-                          <w:b/>
-                          <w:sz w:val="22"/>
-                        </w:rPr>
-                        <w:t>неконфиденциально</w:t>
-                      </w:r>
-                      <w:proofErr w:type="spellEnd"/>
-                      <w:r>
-                        <w:rPr>
-                          <w:b/>
-                          <w:sz w:val="22"/>
-                        </w:rPr>
-                        <w:t>)</w:t>
-                      </w:r>
-                    </w:p>
-                    <w:p>
-                      <w:pPr>
-                        <w:pStyle w:val="2"/>
-                        <w:spacing w:before="0" w:after="0"/>
-                        <w:jc w:val="center"/>
-                        <w:rPr>
-                          <w:rFonts w:ascii="Times New Roman" w:hAnsi="Times New Roman"/>
-                          <w:b w:val="0"/>
-                          <w:i w:val="0"/>
-                          <w:sz w:val="18"/>
-                        </w:rPr>
-                      </w:pPr>
-                      <w:r>
-                        <w:rPr>
-                          <w:rFonts w:ascii="Times New Roman" w:hAnsi="Times New Roman"/>
-                          <w:b w:val="0"/>
-                          <w:i w:val="0"/>
-                          <w:sz w:val="18"/>
-                        </w:rPr>
-                        <w:t>Общество с ограниченной ответственностью «Уральский центр систем безопасности»</w:t>
-                      </w:r>
-                    </w:p>
-                    <w:p>
-                      <w:pPr>
-                        <w:pStyle w:val="2"/>
-                        <w:spacing w:before="0" w:after="0"/>
-                        <w:jc w:val="center"/>
-                        <w:rPr>
-                          <w:rFonts w:ascii="Times New Roman" w:hAnsi="Times New Roman"/>
-                          <w:b w:val="0"/>
-                          <w:i w:val="0"/>
-                          <w:sz w:val="18"/>
-                        </w:rPr>
-                      </w:pPr>
-                      <w:r>
-                        <w:rPr>
-                          <w:rFonts w:ascii="Times New Roman" w:hAnsi="Times New Roman"/>
-                          <w:b w:val="0"/>
-                          <w:i w:val="0"/>
-                          <w:sz w:val="18"/>
-                        </w:rPr>
-                        <w:t>ул. Ткачей, д. 6, Екатеринбург, 620100</w:t>
-                      </w:r>
-                    </w:p>
-                    <w:p>
-                      <w:pPr>
-                        <w:jc w:val="center"/>
-                        <w:rPr>
-                          <w:b/>
-                          <w:sz w:val="22"/>
-                        </w:rPr>
-                      </w:pPr>
-                      <w:r>
-                        <w:rPr>
-                          <w:sz w:val="22"/>
-                        </w:rPr>
-                        <w:t>Экз. № __</w:t>
-                      </w:r>
-                    </w:p>
-                    <w:p>
-                      <w:pPr>
-                        <w:jc w:val="center"/>
-                        <w:rPr>
-                          <w:b/>
-                          <w:sz w:val="22"/>
-                        </w:rPr>
-                      </w:pPr>
-                    </w:p>
-                    <w:p>
-                      <w:pPr>
-                        <w:rPr>
-                          <w:b/>
-                          <w:lang w:eastAsia="en-US"/>
-                        </w:rPr>
-                      </w:pPr>
-                      <w:r>
-                        <w:rPr>
-                          <w:b/>
-                          <w:lang w:eastAsia="en-US"/>
-                        </w:rPr>
-                        <w:t xml:space="preserve">Заместителю генерального директора ООО «Мяу </w:t>
-                      </w:r>
-                      <w:proofErr w:type="spellStart"/>
-                      <w:r>
-                        <w:rPr>
-                          <w:b/>
-                          <w:lang w:eastAsia="en-US"/>
-                        </w:rPr>
-                        <w:t>Кусь</w:t>
-                      </w:r>
-                      <w:proofErr w:type="spellEnd"/>
-                      <w:r>
-                        <w:rPr>
-                          <w:b/>
-                          <w:lang w:eastAsia="en-US"/>
-                        </w:rPr>
-                        <w:t xml:space="preserve">» </w:t>
-                      </w:r>
-                    </w:p>
-                    <w:p>
-                      <w:pPr>
-                        <w:rPr>
-                          <w:b/>
-                          <w:lang w:eastAsia="en-US"/>
-                        </w:rPr>
-                      </w:pPr>
-                    </w:p>
-                    <w:p>
-                      <w:pPr>
-                        <w:rPr>
-                          <w:b/>
-                          <w:lang w:eastAsia="en-US"/>
-                        </w:rPr>
-                      </w:pPr>
-                      <w:r>
-                        <w:rPr>
-                          <w:b/>
-                          <w:lang w:eastAsia="en-US"/>
-                        </w:rPr>
-                        <w:t xml:space="preserve">Иванов </w:t>
-                      </w:r>
-                      <w:proofErr w:type="gramStart"/>
-                      <w:r>
-                        <w:rPr>
-                          <w:b/>
-                          <w:lang w:eastAsia="en-US"/>
-                        </w:rPr>
-                        <w:t>И.И.</w:t>
-                      </w:r>
-                      <w:proofErr w:type="gramEnd"/>
-                    </w:p>
-                    <w:p>
-                      <w:pPr>
-                        <w:rPr>
-                          <w:lang w:val="en-US"/>
-                        </w:rPr>
-                      </w:pPr>
-                    </w:p>
-                  </w:txbxContent>
-                </v:textbox>
-                <w10:wrap anchorx="margin"/>
-              </v:shape>
-            </w:pict>
-          </mc:Fallback>
-        </mc:AlternateContent>
-      </w:r>
-      <w:r>
-        <w:rPr>
-          <w:noProof/>
-        </w:rPr>
-        <w:drawing>
-          <wp:inline distT="0" distB="0" distL="0" distR="0" wp14:anchorId="092BE851" wp14:editId="015D6052">
-            <wp:extent cx="3095625" cy="2302843"/>
-            <wp:effectExtent l="0" t="0" r="0" b="2540"/>
-            <wp:docPr id="1151606003" name="Рисунок 4" descr="Изображение выглядит как текст, Шрифт, снимок экрана&#10;&#10;Контент, сгенерированный ИИ, может содержать ошибки."/>
-            <wp:cNvGraphicFramePr>
-              <a:graphicFrameLocks xmlns:a="http://schemas.openxmlformats.org/drawingml/2006/main" noChangeAspect="1"/>
-            </wp:cNvGraphicFramePr>
-            <a:graphic xmlns:a="http://schemas.openxmlformats.org/drawingml/2006/main">
-              <a:graphicData uri="http://schemas.openxmlformats.org/drawingml/2006/picture">
-                <pic:pic xmlns:pic="http://schemas.openxmlformats.org/drawingml/2006/picture">
-                  <pic:nvPicPr>
-                    <pic:cNvPr id="1151606003" name="Рисунок 4" descr="Изображение выглядит как текст, Шрифт, снимок экрана&#10;&#10;Контент, сгенерированный ИИ, может содержать ошибки."/>
-                    <pic:cNvPicPr>
-                      <a:picLocks noChangeAspect="1" noChangeArrowheads="1"/>
-                    </pic:cNvPicPr>
-                  </pic:nvPicPr>
-                  <pic:blipFill>
-                    <a:blip r:embed="rId8">
-                      <a:extLst>
-                        <a:ext uri="{28A0092B-C50C-407E-A947-70E740481C1C}">
-                          <a14:useLocalDpi xmlns:a14="http://schemas.microsoft.com/office/drawing/2010/main" val="0"/>
-                        </a:ext>
-                      </a:extLst>
-                    </a:blip>
-                    <a:srcRect/>
-                    <a:stretch>
-                      <a:fillRect/>
-                    </a:stretch>
-                  </pic:blipFill>
-                  <pic:spPr bwMode="auto">
-                    <a:xfrm>
-                      <a:off x="0" y="0"/>
-                      <a:ext cx="3096655" cy="2303609"/>
-                    </a:xfrm>
-                    <a:prstGeom prst="rect">
-                      <a:avLst/>
-                    </a:prstGeom>
-                    <a:noFill/>
-                    <a:ln>
-                      <a:noFill/>
-                    </a:ln>
-                  </pic:spPr>
-                </pic:pic>
-              </a:graphicData>
-            </a:graphic>
-          </wp:inline>
-        </w:drawing>
-      </w:r>
-    </w:p>
     <w:tbl>
       <w:tblPr>
         <w:tblStyle w:val="aa"/>
-        <w:tblW w:w="0" w:type="auto"/>
+        <w:tblpPr w:leftFromText="180" w:rightFromText="180" w:vertAnchor="text" w:horzAnchor="margin" w:tblpY="-607"/>
+        <w:tblW w:w="10343" w:type="dxa"/>
         <w:tblInd w:w="0" w:type="dxa"/>
-        <w:tblBorders>
-          <w:top w:val="none" w:sz="0" w:space="0" w:color="auto"/>
-          <w:left w:val="none" w:sz="0" w:space="0" w:color="auto"/>
-          <w:right w:val="none" w:sz="0" w:space="0" w:color="auto"/>
-        </w:tblBorders>
         <w:tblLook w:val="04A0" w:firstRow="1" w:lastRow="0" w:firstColumn="1" w:lastColumn="0" w:noHBand="0" w:noVBand="1"/>
       </w:tblPr>
       <w:tblGrid>
         <w:gridCol w:w="704"/>
-        <w:gridCol w:w="1423"/>
-        <w:gridCol w:w="425"/>
-        <w:gridCol w:w="2073"/>
+        <w:gridCol w:w="1559"/>
+        <w:gridCol w:w="426"/>
+        <w:gridCol w:w="2447"/>
+        <w:gridCol w:w="5207"/>
       </w:tblGrid>
       <w:tr>
+        <w:trPr>
+          <w:trHeight w:val="3399"/>
+        </w:trPr>
         <w:tc>
           <w:tcPr>
-            <w:tcW w:w="2127" w:type="dxa"/>
+            <w:tcW w:w="5136" w:type="dxa"/>
+            <w:gridSpan w:val="4"/>
+            <w:tcBorders>
+              <w:top w:val="nil"/>
+              <w:left w:val="nil"/>
+              <w:bottom w:val="nil"/>
+              <w:right w:val="nil"/>
+            </w:tcBorders>
+          </w:tcPr>
+          <w:p>
+            <w:r>
+              <w:rPr>
+                <w:noProof/>
+              </w:rPr>
+              <w:drawing>
+                <wp:inline distT="0" distB="0" distL="0" distR="0" wp14:anchorId="447198BF" wp14:editId="54FDA34A">
+                  <wp:extent cx="3124200" cy="2324100"/>
+                  <wp:effectExtent l="0" t="0" r="0" b="0"/>
+                  <wp:docPr id="1761229621" name="Рисунок 4" descr="Изображение выглядит как текст, Шрифт, снимок экрана&#10;&#10;Контент, сгенерированный ИИ, может содержать ошибки."/>
+                  <wp:cNvGraphicFramePr>
+                    <a:graphicFrameLocks xmlns:a="http://schemas.openxmlformats.org/drawingml/2006/main" noChangeAspect="1"/>
+                  </wp:cNvGraphicFramePr>
+                  <a:graphic xmlns:a="http://schemas.openxmlformats.org/drawingml/2006/main">
+                    <a:graphicData uri="http://schemas.openxmlformats.org/drawingml/2006/picture">
+                      <pic:pic xmlns:pic="http://schemas.openxmlformats.org/drawingml/2006/picture">
+                        <pic:nvPicPr>
+                          <pic:cNvPr id="1151606003" name="Рисунок 4" descr="Изображение выглядит как текст, Шрифт, снимок экрана&#10;&#10;Контент, сгенерированный ИИ, может содержать ошибки."/>
+                          <pic:cNvPicPr>
+                            <a:picLocks noChangeAspect="1" noChangeArrowheads="1"/>
+                          </pic:cNvPicPr>
+                        </pic:nvPicPr>
+                        <pic:blipFill>
+                          <a:blip r:embed="rId8">
+                            <a:extLst>
+                              <a:ext uri="{28A0092B-C50C-407E-A947-70E740481C1C}">
+                                <a14:useLocalDpi xmlns:a14="http://schemas.microsoft.com/office/drawing/2010/main" val="0"/>
+                              </a:ext>
+                            </a:extLst>
+                          </a:blip>
+                          <a:srcRect/>
+                          <a:stretch>
+                            <a:fillRect/>
+                          </a:stretch>
+                        </pic:blipFill>
+                        <pic:spPr bwMode="auto">
+                          <a:xfrm>
+                            <a:off x="0" y="0"/>
+                            <a:ext cx="3124200" cy="2324100"/>
+                          </a:xfrm>
+                          <a:prstGeom prst="rect">
+                            <a:avLst/>
+                          </a:prstGeom>
+                          <a:noFill/>
+                          <a:ln>
+                            <a:noFill/>
+                          </a:ln>
+                        </pic:spPr>
+                      </pic:pic>
+                    </a:graphicData>
+                  </a:graphic>
+                </wp:inline>
+              </w:drawing>
+            </w:r>
+          </w:p>
+        </w:tc>
+        <w:tc>
+          <w:tcPr>
+            <w:tcW w:w="5207" w:type="dxa"/>
+            <w:vMerge w:val="restart"/>
+            <w:tcBorders>
+              <w:top w:val="nil"/>
+              <w:left w:val="nil"/>
+              <w:bottom w:val="nil"/>
+              <w:right w:val="nil"/>
+            </w:tcBorders>
+          </w:tcPr>
+          <w:p>
+            <w:pPr>
+              <w:rPr>
+                <w:b/>
+                <w:sz w:val="22"/>
+              </w:rPr>
+            </w:pPr>
+          </w:p>
+          <w:p>
+            <w:pPr>
+              <w:rPr>
+                <w:b/>
+                <w:sz w:val="22"/>
+              </w:rPr>
+            </w:pPr>
+          </w:p>
+          <w:p>
+            <w:pPr>
+              <w:jc w:val="center"/>
+              <w:rPr>
+                <w:b/>
+                <w:sz w:val="22"/>
+              </w:rPr>
+            </w:pPr>
+          </w:p>
+          <w:p>
+            <w:pPr>
+              <w:jc w:val="center"/>
+              <w:rPr>
+                <w:b/>
+                <w:sz w:val="22"/>
+              </w:rPr>
+            </w:pPr>
+          </w:p>
+          <w:p>
+            <w:pPr>
+              <w:jc w:val="center"/>
+              <w:rPr>
+                <w:b/>
+                <w:sz w:val="22"/>
+              </w:rPr>
+            </w:pPr>
+            <w:r>
+              <w:rPr>
+                <w:b/>
+                <w:sz w:val="22"/>
+              </w:rPr>
+              <w:t>КОММЕРЧЕСКАЯ ТАЙНА</w:t>
+            </w:r>
+          </w:p>
+          <w:p>
+            <w:pPr>
+              <w:jc w:val="center"/>
+              <w:rPr>
+                <w:b/>
+                <w:sz w:val="22"/>
+              </w:rPr>
+            </w:pPr>
+            <w:r>
+              <w:rPr>
+                <w:b/>
+                <w:sz w:val="22"/>
+              </w:rPr>
+              <w:t>(без приложения неконфиденциально)</w:t>
+            </w:r>
+          </w:p>
+          <w:p>
+            <w:pPr>
+              <w:pStyle w:val="2"/>
+              <w:spacing w:before="0" w:after="0"/>
+              <w:jc w:val="center"/>
+              <w:rPr>
+                <w:rFonts w:ascii="Times New Roman" w:hAnsi="Times New Roman"/>
+                <w:b w:val="0"/>
+                <w:i w:val="0"/>
+                <w:sz w:val="18"/>
+              </w:rPr>
+            </w:pPr>
+            <w:r>
+              <w:rPr>
+                <w:rFonts w:ascii="Times New Roman" w:hAnsi="Times New Roman"/>
+                <w:b w:val="0"/>
+                <w:i w:val="0"/>
+                <w:sz w:val="18"/>
+              </w:rPr>
+              <w:t>Общество с ограниченной ответственностью «Уральский центр систем безопасности»</w:t>
+            </w:r>
+          </w:p>
+          <w:p>
+            <w:pPr>
+              <w:pStyle w:val="2"/>
+              <w:spacing w:before="0" w:after="0"/>
+              <w:jc w:val="center"/>
+              <w:rPr>
+                <w:rFonts w:ascii="Times New Roman" w:hAnsi="Times New Roman"/>
+                <w:b w:val="0"/>
+                <w:i w:val="0"/>
+                <w:sz w:val="18"/>
+              </w:rPr>
+            </w:pPr>
+            <w:r>
+              <w:rPr>
+                <w:rFonts w:ascii="Times New Roman" w:hAnsi="Times New Roman"/>
+                <w:b w:val="0"/>
+                <w:i w:val="0"/>
+                <w:sz w:val="18"/>
+              </w:rPr>
+              <w:t>ул. Ткачей, д. 6, Екатеринбург, 620100</w:t>
+            </w:r>
+          </w:p>
+          <w:p>
+            <w:pPr>
+              <w:jc w:val="center"/>
+              <w:rPr>
+                <w:b/>
+                <w:sz w:val="22"/>
+              </w:rPr>
+            </w:pPr>
+            <w:r>
+              <w:rPr>
+                <w:sz w:val="22"/>
+              </w:rPr>
+              <w:t>Экз. № __</w:t>
+            </w:r>
+          </w:p>
+          <w:p>
+            <w:pPr>
+              <w:jc w:val="center"/>
+              <w:rPr>
+                <w:b/>
+                <w:sz w:val="22"/>
+              </w:rPr>
+            </w:pPr>
+          </w:p>
+          <w:p>
+            <w:pPr>
+              <w:rPr>
+                <w:b/>
+                <w:lang w:eastAsia="en-US"/>
+              </w:rPr>
+            </w:pPr>
+            <w:r>
+              <w:rPr>
+                <w:b/>
+                <w:lang w:eastAsia="en-US"/>
+              </w:rPr>
+              <w:t>Заместителю генерального директора ООО «Мяу Кусь»</w:t>
+            </w:r>
+            <w:r>
+              <w:rPr>
+                <w:b/>
+                <w:lang w:eastAsia="en-US"/>
+              </w:rPr>
+            </w:r>
+            <w:r>
+              <w:rPr>
+                <w:b/>
+                <w:lang w:eastAsia="en-US"/>
+              </w:rPr>
+            </w:r>
+          </w:p>
+          <w:p>
+            <w:pPr>
+              <w:rPr>
+                <w:b/>
+                <w:lang w:eastAsia="en-US"/>
+              </w:rPr>
+            </w:pPr>
+          </w:p>
+          <w:p>
+            <w:pPr>
+              <w:rPr>
+                <w:b/>
+                <w:bCs/>
+              </w:rPr>
+            </w:pPr>
+            <w:r>
+              <w:rPr>
+                <w:b/>
+                <w:bCs/>
+              </w:rPr>
+              <w:t>Аоываыв А.А.</w:t>
+            </w:r>
+            <w:r>
+              <w:rPr>
+                <w:b/>
+                <w:bCs/>
+              </w:rPr>
+            </w:r>
+            <w:r>
+              <w:rPr>
+                <w:b/>
+                <w:bCs/>
+              </w:rPr>
+            </w:r>
+          </w:p>
+          <w:p/>
+        </w:tc>
+      </w:tr>
+      <w:tr>
+        <w:trPr>
+          <w:trHeight w:val="152"/>
+        </w:trPr>
+        <w:tc>
+          <w:tcPr>
+            <w:tcW w:w="2263" w:type="dxa"/>
             <w:gridSpan w:val="2"/>
             <w:tcBorders>
               <w:top w:val="nil"/>
               <w:left w:val="nil"/>
+              <w:bottom w:val="single" w:sz="4" w:space="0" w:color="auto"/>
               <w:right w:val="nil"/>
             </w:tcBorders>
             <w:vAlign w:val="center"/>
@@ -560,7 +319,6 @@
               <w:jc w:val="center"/>
               <w:rPr>
                 <w:noProof/>
-                <w:lang w:val="en-US"/>
               </w:rPr>
             </w:pPr>
             <w:r>
@@ -574,14 +332,14 @@
         </w:tc>
         <w:tc>
           <w:tcPr>
-            <w:tcW w:w="425" w:type="dxa"/>
+            <w:tcW w:w="426" w:type="dxa"/>
             <w:tcBorders>
               <w:top w:val="nil"/>
               <w:left w:val="nil"/>
               <w:bottom w:val="nil"/>
               <w:right w:val="nil"/>
             </w:tcBorders>
-            <w:vAlign w:val="bottom"/>
+            <w:vAlign w:val="center"/>
           </w:tcPr>
           <w:p>
             <w:pPr>
@@ -602,7 +360,7 @@
         </w:tc>
         <w:tc>
           <w:tcPr>
-            <w:tcW w:w="1701" w:type="dxa"/>
+            <w:tcW w:w="2447" w:type="dxa"/>
             <w:tcBorders>
               <w:top w:val="nil"/>
               <w:left w:val="nil"/>
@@ -616,7 +374,6 @@
               <w:jc w:val="center"/>
               <w:rPr>
                 <w:noProof/>
-                <w:lang w:val="en-US"/>
               </w:rPr>
             </w:pPr>
             <w:r>
@@ -628,10 +385,30 @@
             </w:r>
           </w:p>
         </w:tc>
+        <w:tc>
+          <w:tcPr>
+            <w:tcW w:w="5207" w:type="dxa"/>
+            <w:vMerge/>
+            <w:tcBorders>
+              <w:top w:val="nil"/>
+              <w:left w:val="nil"/>
+              <w:bottom w:val="nil"/>
+              <w:right w:val="nil"/>
+            </w:tcBorders>
+          </w:tcPr>
+          <w:p>
+            <w:pPr>
+              <w:rPr>
+                <w:b/>
+                <w:sz w:val="22"/>
+              </w:rPr>
+            </w:pPr>
+          </w:p>
+        </w:tc>
       </w:tr>
       <w:tr>
         <w:trPr>
-          <w:trHeight w:val="363"/>
+          <w:trHeight w:val="156"/>
         </w:trPr>
         <w:tc>
           <w:tcPr>
@@ -642,10 +419,11 @@
               <w:bottom w:val="nil"/>
               <w:right w:val="nil"/>
             </w:tcBorders>
-            <w:vAlign w:val="bottom"/>
+            <w:vAlign w:val="center"/>
           </w:tcPr>
           <w:p>
             <w:pPr>
+              <w:jc w:val="center"/>
               <w:rPr>
                 <w:noProof/>
               </w:rPr>
@@ -662,9 +440,11 @@
         </w:tc>
         <w:tc>
           <w:tcPr>
-            <w:tcW w:w="1423" w:type="dxa"/>
+            <w:tcW w:w="1559" w:type="dxa"/>
             <w:tcBorders>
+              <w:top w:val="nil"/>
               <w:left w:val="nil"/>
+              <w:bottom w:val="single" w:sz="4" w:space="0" w:color="auto"/>
               <w:right w:val="nil"/>
             </w:tcBorders>
             <w:vAlign w:val="center"/>
@@ -680,17 +460,18 @@
         </w:tc>
         <w:tc>
           <w:tcPr>
-            <w:tcW w:w="425" w:type="dxa"/>
+            <w:tcW w:w="426" w:type="dxa"/>
             <w:tcBorders>
               <w:top w:val="nil"/>
               <w:left w:val="nil"/>
               <w:bottom w:val="nil"/>
               <w:right w:val="nil"/>
             </w:tcBorders>
-            <w:vAlign w:val="bottom"/>
+            <w:vAlign w:val="center"/>
           </w:tcPr>
           <w:p>
             <w:pPr>
+              <w:jc w:val="center"/>
               <w:rPr>
                 <w:noProof/>
               </w:rPr>
@@ -715,10 +496,11 @@
         </w:tc>
         <w:tc>
           <w:tcPr>
-            <w:tcW w:w="1701" w:type="dxa"/>
+            <w:tcW w:w="2447" w:type="dxa"/>
             <w:tcBorders>
               <w:top w:val="single" w:sz="4" w:space="0" w:color="auto"/>
               <w:left w:val="nil"/>
+              <w:bottom w:val="single" w:sz="4" w:space="0" w:color="auto"/>
               <w:right w:val="nil"/>
             </w:tcBorders>
             <w:vAlign w:val="center"/>
@@ -732,22 +514,43 @@
             </w:pPr>
           </w:p>
         </w:tc>
+        <w:tc>
+          <w:tcPr>
+            <w:tcW w:w="5207" w:type="dxa"/>
+            <w:vMerge/>
+            <w:tcBorders>
+              <w:top w:val="nil"/>
+              <w:left w:val="nil"/>
+              <w:bottom w:val="nil"/>
+              <w:right w:val="nil"/>
+            </w:tcBorders>
+          </w:tcPr>
+          <w:p>
+            <w:pPr>
+              <w:rPr>
+                <w:b/>
+                <w:sz w:val="22"/>
+              </w:rPr>
+            </w:pPr>
+          </w:p>
+        </w:tc>
       </w:tr>
     </w:tbl>
     <w:p>
       <w:pPr>
-        <w:ind w:left="142"/>
         <w:rPr>
-          <w:noProof/>
+          <w:sz w:val="22"/>
+          <w:szCs w:val="20"/>
+          <w:lang w:val="en-US"/>
         </w:rPr>
       </w:pPr>
     </w:p>
     <w:p>
       <w:pPr>
         <w:rPr>
-          <w:i/>
           <w:sz w:val="22"/>
           <w:szCs w:val="20"/>
+          <w:lang w:val="en-US"/>
         </w:rPr>
       </w:pPr>
       <w:r>
@@ -775,7 +578,17 @@
     </w:p>
     <w:p>
       <w:pPr>
-        <w:ind w:left="142"/>
+        <w:tabs>
+          <w:tab w:val="left" w:pos="567"/>
+          <w:tab w:val="left" w:pos="993"/>
+        </w:tabs>
+        <w:spacing w:line="360" w:lineRule="auto"/>
+        <w:ind w:firstLine="709"/>
+        <w:jc w:val="center"/>
+        <w:rPr>
+          <w:b/>
+          <w:lang w:val="en-US"/>
+        </w:rPr>
       </w:pPr>
     </w:p>
     <w:p>
@@ -795,25 +608,32 @@
         <w:rPr>
           <w:b/>
         </w:rPr>
-        <w:t>Уважаемый</w:t>
+        <w:t>Уважаемый Аоываыв А.А.!</w:t>
       </w:r>
       <w:r>
         <w:rPr>
           <w:b/>
         </w:rPr>
-        <w:t xml:space="preserve"> </w:t>
       </w:r>
       <w:r>
         <w:rPr>
           <w:b/>
         </w:rPr>
-        <w:t>Иван Иванович</w:t>
       </w:r>
       <w:r>
         <w:rPr>
           <w:b/>
         </w:rPr>
-        <w:t>!</w:t>
+      </w:r>
+      <w:r>
+        <w:rPr>
+          <w:b/>
+        </w:rPr>
+      </w:r>
+      <w:r>
+        <w:rPr>
+          <w:b/>
+        </w:rPr>
       </w:r>
     </w:p>
     <w:p>
@@ -829,124 +649,135 @@
         <w:rPr>
           <w:color w:val="auto"/>
         </w:rPr>
-        <w:t xml:space="preserve">Представляю Вам </w:t>
+        <w:t>Представляю Вам рабочую документацию по проекту «Дооснащение подсистем котов в домашних условиях ООО «Мур мяу», разработанную в рамках договора подряда 3432423 от 2020-12-12, (далее – Рабочая документация) на электронном носителе согласно Приложению.</w:t>
       </w:r>
       <w:r>
         <w:rPr>
           <w:color w:val="auto"/>
         </w:rPr>
-        <w:t>рабочую</w:t>
       </w:r>
       <w:r>
         <w:rPr>
           <w:color w:val="auto"/>
         </w:rPr>
-        <w:t xml:space="preserve"> </w:t>
       </w:r>
       <w:r>
         <w:rPr>
           <w:color w:val="auto"/>
         </w:rPr>
-        <w:t>документацию</w:t>
       </w:r>
       <w:r>
         <w:rPr>
           <w:color w:val="auto"/>
         </w:rPr>
-        <w:t xml:space="preserve"> </w:t>
       </w:r>
       <w:r>
         <w:rPr>
           <w:color w:val="auto"/>
         </w:rPr>
-        <w:t xml:space="preserve">по </w:t>
       </w:r>
       <w:r>
         <w:rPr>
           <w:color w:val="auto"/>
         </w:rPr>
-        <w:t>проекту</w:t>
       </w:r>
       <w:r>
         <w:rPr>
           <w:color w:val="auto"/>
         </w:rPr>
-        <w:t xml:space="preserve"> «</w:t>
       </w:r>
       <w:r>
         <w:rPr>
           <w:color w:val="auto"/>
         </w:rPr>
-        <w:t xml:space="preserve">Дооснащение подсистем безопасности </w:t>
       </w:r>
       <w:r>
         <w:rPr>
           <w:color w:val="auto"/>
         </w:rPr>
-        <w:t>кошек в обычной жизни ООО «Мяу мышь»</w:t>
       </w:r>
       <w:r>
         <w:rPr>
           <w:color w:val="auto"/>
         </w:rPr>
-        <w:t>,</w:t>
       </w:r>
       <w:r>
         <w:rPr>
           <w:color w:val="auto"/>
         </w:rPr>
-        <w:t xml:space="preserve"> </w:t>
       </w:r>
       <w:r>
         <w:rPr>
           <w:color w:val="auto"/>
         </w:rPr>
-        <w:t xml:space="preserve">разработанную </w:t>
       </w:r>
       <w:r>
         <w:rPr>
           <w:color w:val="auto"/>
         </w:rPr>
-        <w:t>в рамках</w:t>
-      </w:r>
-      <w:r>
-        <w:t xml:space="preserve"> </w:t>
-      </w:r>
-      <w:r>
-        <w:t>договора подряда №</w:t>
-      </w:r>
-      <w:r>
-        <w:t>РД-</w:t>
-      </w:r>
-      <w:r>
-        <w:t>5870 от 25.02.2025</w:t>
-      </w:r>
-      <w:r>
-        <w:t>,</w:t>
-      </w:r>
-      <w:r>
-        <w:t xml:space="preserve"> </w:t>
-      </w:r>
-      <w:r>
-        <w:t xml:space="preserve">(далее – Рабочая документация) </w:t>
-      </w:r>
-      <w:r>
-        <w:t xml:space="preserve">на </w:t>
-      </w:r>
-      <w:r>
-        <w:t>электронном носител</w:t>
-      </w:r>
-      <w:r>
-        <w:t>е</w:t>
-      </w:r>
-      <w:r>
-        <w:t xml:space="preserve"> </w:t>
       </w:r>
       <w:r>
         <w:rPr>
           <w:color w:val="auto"/>
         </w:rPr>
-        <w:t>согласно Приложению.</w:t>
+      </w:r>
+      <w:r>
+        <w:rPr>
+          <w:color w:val="auto"/>
+        </w:rPr>
+      </w:r>
+      <w:r>
+        <w:rPr/>
+      </w:r>
+      <w:r>
+        <w:rPr/>
+      </w:r>
+      <w:r>
+        <w:rPr/>
+      </w:r>
+      <w:r>
+        <w:rPr/>
+      </w:r>
+      <w:r>
+        <w:rPr/>
+      </w:r>
+      <w:r>
+        <w:rPr/>
+      </w:r>
+      <w:r>
+        <w:rPr/>
+      </w:r>
+      <w:r>
+        <w:rPr/>
+      </w:r>
+      <w:r>
+        <w:rPr/>
+      </w:r>
+      <w:r>
+        <w:rPr/>
+      </w:r>
+      <w:r>
+        <w:rPr/>
+      </w:r>
+      <w:r>
+        <w:rPr/>
+      </w:r>
+      <w:r>
+        <w:rPr/>
+      </w:r>
+      <w:r>
+        <w:rPr/>
+      </w:r>
+      <w:r>
+        <w:rPr/>
+      </w:r>
+      <w:r>
+        <w:rPr/>
+      </w:r>
+      <w:r>
+        <w:rPr>
+          <w:color w:val="auto"/>
+        </w:rPr>
       </w:r>
     </w:p>
     <w:p>
@@ -994,7 +825,10 @@
           <w:numId w:val="1"/>
         </w:numPr>
         <w:jc w:val="both"/>
-        <w:ind w:left="1065" w:hanging="357" w:firstLine="-357"/>
+        <w:ind w:left="141" w:firstLine="567"/>
+        <w:tabs>
+          <w:tab w:val="left" w:pos="992"/>
+        </w:tabs>
         <w:spacing w:before="0" w:after="0" w:line="360" w:lineRule="auto"/>
       </w:pPr>
       <w:r>
@@ -1008,7 +842,10 @@
           <w:numId w:val="1"/>
         </w:numPr>
         <w:jc w:val="both"/>
-        <w:ind w:left="1065" w:hanging="357" w:firstLine="-357"/>
+        <w:ind w:left="141" w:firstLine="567"/>
+        <w:tabs>
+          <w:tab w:val="left" w:pos="992"/>
+        </w:tabs>
         <w:spacing w:before="0" w:after="0" w:line="360" w:lineRule="auto"/>
       </w:pPr>
       <w:r>
@@ -1022,11 +859,14 @@
           <w:numId w:val="1"/>
         </w:numPr>
         <w:jc w:val="both"/>
-        <w:ind w:left="1065" w:hanging="357" w:firstLine="-357"/>
+        <w:ind w:left="141" w:firstLine="567"/>
+        <w:tabs>
+          <w:tab w:val="left" w:pos="992"/>
+        </w:tabs>
         <w:spacing w:before="0" w:after="0" w:line="360" w:lineRule="auto"/>
       </w:pPr>
       <w:r>
-        <w:t>Дооснащение подсистем котов в домашних условиях ООО «Мур мяу», инв. № 240173 - на 4 л. в 4 экз.</w:t>
+        <w:t>Дооснащение подсистем котов в домашних условиях ООО «Мур мяу», инв. № 240173 - на 4 л. в  4 экз.</w:t>
       </w:r>
     </w:p>
     <w:p>
@@ -1036,7 +876,10 @@
           <w:numId w:val="1"/>
         </w:numPr>
         <w:jc w:val="both"/>
-        <w:ind w:left="1065" w:hanging="357" w:firstLine="-357"/>
+        <w:ind w:left="141" w:firstLine="567"/>
+        <w:tabs>
+          <w:tab w:val="left" w:pos="992"/>
+        </w:tabs>
         <w:spacing w:before="0" w:after="0" w:line="360" w:lineRule="auto"/>
       </w:pPr>
       <w:r>
@@ -1050,7 +893,10 @@
           <w:numId w:val="1"/>
         </w:numPr>
         <w:jc w:val="both"/>
-        <w:ind w:left="1065" w:hanging="357" w:firstLine="-357"/>
+        <w:ind w:left="141" w:firstLine="567"/>
+        <w:tabs>
+          <w:tab w:val="left" w:pos="992"/>
+        </w:tabs>
         <w:spacing w:before="0" w:after="0" w:line="360" w:lineRule="auto"/>
       </w:pPr>
       <w:r>
@@ -1064,11 +910,14 @@
           <w:numId w:val="1"/>
         </w:numPr>
         <w:jc w:val="both"/>
-        <w:ind w:left="1065" w:hanging="357" w:firstLine="-357"/>
+        <w:ind w:left="141" w:firstLine="567"/>
+        <w:tabs>
+          <w:tab w:val="left" w:pos="992"/>
+        </w:tabs>
         <w:spacing w:before="0" w:after="0" w:line="360" w:lineRule="auto"/>
       </w:pPr>
       <w:r>
-        <w:t>Дооснащение подсистем котов в домашних условиях ООО «Мур мяу», инв. № 240173 - на 4 л. в 4 экз.</w:t>
+        <w:t>Дооснащение подсистем котов в домашних условиях ООО «Мур мяу», инв. № 240173 - на 4 л. в  4 экз.</w:t>
       </w:r>
     </w:p>
     <w:p>
@@ -1078,7 +927,10 @@
           <w:numId w:val="1"/>
         </w:numPr>
         <w:jc w:val="both"/>
-        <w:ind w:left="1065" w:hanging="357" w:firstLine="-357"/>
+        <w:ind w:left="141" w:firstLine="567"/>
+        <w:tabs>
+          <w:tab w:val="left" w:pos="992"/>
+        </w:tabs>
         <w:spacing w:before="0" w:after="0" w:line="360" w:lineRule="auto"/>
       </w:pPr>
       <w:r>
@@ -1092,11 +944,14 @@
           <w:numId w:val="1"/>
         </w:numPr>
         <w:jc w:val="both"/>
-        <w:ind w:left="1065" w:hanging="357" w:firstLine="-357"/>
+        <w:ind w:left="141" w:firstLine="567"/>
+        <w:tabs>
+          <w:tab w:val="left" w:pos="992"/>
+        </w:tabs>
         <w:spacing w:before="0" w:after="0" w:line="360" w:lineRule="auto"/>
       </w:pPr>
       <w:r>
-        <w:t>Дооснащение подсистем котов в домашних условиях ООО «Мур мяу», инв. № 240173 - на 4 л. в 4 экз.</w:t>
+        <w:t>Дооснащение подсистем котов в домашних условиях ООО «Мур мяу», инв. № 240173 - на 4 л. в  4 экз.</w:t>
       </w:r>
     </w:p>
     <w:p>
@@ -1106,7 +961,10 @@
           <w:numId w:val="1"/>
         </w:numPr>
         <w:jc w:val="both"/>
-        <w:ind w:left="1065" w:hanging="357" w:firstLine="-357"/>
+        <w:ind w:left="141" w:firstLine="567"/>
+        <w:tabs>
+          <w:tab w:val="left" w:pos="992"/>
+        </w:tabs>
         <w:spacing w:before="0" w:after="0" w:line="360" w:lineRule="auto"/>
       </w:pPr>
       <w:r>
@@ -1120,11 +978,14 @@
           <w:numId w:val="1"/>
         </w:numPr>
         <w:jc w:val="both"/>
-        <w:ind w:left="1065" w:hanging="357" w:firstLine="-357"/>
+        <w:ind w:left="141" w:firstLine="567"/>
+        <w:tabs>
+          <w:tab w:val="left" w:pos="992"/>
+        </w:tabs>
         <w:spacing w:before="0" w:after="0" w:line="360" w:lineRule="auto"/>
       </w:pPr>
       <w:r>
-        <w:t>Дооснащение подсистем котов в домашних условиях ООО «Мур мяу», инв. № 240173 - на 4 л. в 4 экз.</w:t>
+        <w:t>Дооснащение подсистем котов в домашних условиях ООО «Мур мяу», инв. № 240173 - на 4 л. в  4 экз.</w:t>
       </w:r>
     </w:p>
     <w:p>
@@ -1221,14 +1082,23 @@
             <w:pPr>
               <w:spacing w:line="360" w:lineRule="auto"/>
               <w:jc w:val="right"/>
+              <w:rPr>
+                <w:lang w:val="en-US"/>
+              </w:rPr>
             </w:pPr>
-            <w:proofErr w:type="gramStart"/>
             <w:r>
-              <w:t>В.Е.</w:t>
+              <w:rPr>
+                <w:lang w:val="en-US"/>
+              </w:rPr>
+              <w:t>А. Б. Апвыа</w:t>
             </w:r>
-            <w:proofErr w:type="gramEnd"/>
             <w:r>
-              <w:t xml:space="preserve"> Кушнаренко</w:t>
+              <w:rPr/>
+            </w:r>
+            <w:r>
+              <w:rPr>
+                <w:lang w:val="en-US"/>
+              </w:rPr>
             </w:r>
           </w:p>
         </w:tc>
@@ -1255,12 +1125,13 @@
       <w:pPr>
         <w:spacing w:line="14" w:lineRule="atLeast"/>
         <w:sectPr>
-          <w:headerReference w:type="even" r:id="rId9"/>
-          <w:headerReference w:type="default" r:id="rId10"/>
-          <w:footerReference w:type="even" r:id="rId11"/>
-          <w:footerReference w:type="default" r:id="rId12"/>
-          <w:headerReference w:type="first" r:id="rId13"/>
-          <w:footerReference w:type="first" r:id="rId14"/>
+          <w:footerReference w:type="even" r:id="rId9"/>
+          <w:footerReference w:type="default" r:id="rId10"/>
+          <w:footerReference w:type="first" r:id="rId11"/>
+          <w:headerReference w:type="default" r:id="rId15"/>
+          <w:headerReference w:type="even" r:id="rId16"/>
+          <w:headerReference w:type="first" r:id="rId17"/>
+          <w:type w:val="continuous"/>
           <w:pgSz w:w="11906" w:h="16838"/>
           <w:pgMar w:top="1134" w:right="567" w:bottom="1134" w:left="1134" w:header="709" w:footer="709" w:gutter="0"/>
           <w:cols w:space="708"/>
@@ -1271,7 +1142,7 @@
     </w:p>
     <w:p/>
     <w:sectPr>
-      <w:footerReference w:type="first" r:id="rId15"/>
+      <w:footerReference w:type="first" r:id="rId12"/>
       <w:pgSz w:w="11906" w:h="16838"/>
       <w:pgMar w:top="567" w:right="849" w:bottom="567" w:left="1134" w:header="709" w:footer="709" w:gutter="0"/>
       <w:cols w:space="708"/>
@@ -1366,6 +1237,7 @@
       <w:rPr>
         <w:sz w:val="16"/>
         <w:szCs w:val="16"/>
+        <w:lang w:val="en-US"/>
       </w:rPr>
     </w:pPr>
     <w:r>
@@ -1419,21 +1291,12 @@
         <w:szCs w:val="16"/>
       </w:rPr>
     </w:pPr>
-    <w:proofErr w:type="spellStart"/>
     <w:r>
       <w:rPr>
         <w:sz w:val="16"/>
         <w:szCs w:val="16"/>
       </w:rPr>
-      <w:t>Отп</w:t>
-    </w:r>
-    <w:proofErr w:type="spellEnd"/>
-    <w:r>
-      <w:rPr>
-        <w:sz w:val="16"/>
-        <w:szCs w:val="16"/>
-      </w:rPr>
-      <w:t xml:space="preserve">. 2 экз., на </w:t>
+      <w:t xml:space="preserve">Отп. 2 экз., на </w:t>
     </w:r>
     <w:r>
       <w:rPr>
@@ -1495,33 +1358,8 @@
         <w:sz w:val="16"/>
         <w:szCs w:val="16"/>
       </w:rPr>
-      <w:t xml:space="preserve">Исп. и </w:t>
+      <w:t>Исп. и отп. Гараева К.Д.</w:t>
     </w:r>
-    <w:proofErr w:type="spellStart"/>
-    <w:r>
-      <w:rPr>
-        <w:sz w:val="16"/>
-        <w:szCs w:val="16"/>
-      </w:rPr>
-      <w:t>отп</w:t>
-    </w:r>
-    <w:proofErr w:type="spellEnd"/>
-    <w:r>
-      <w:rPr>
-        <w:sz w:val="16"/>
-        <w:szCs w:val="16"/>
-      </w:rPr>
-      <w:t xml:space="preserve">. Гараева </w:t>
-    </w:r>
-    <w:proofErr w:type="gramStart"/>
-    <w:r>
-      <w:rPr>
-        <w:sz w:val="16"/>
-        <w:szCs w:val="16"/>
-      </w:rPr>
-      <w:t>К.Д.</w:t>
-    </w:r>
-    <w:proofErr w:type="gramEnd"/>
   </w:p>
   <w:p>
     <w:pPr>
@@ -1543,35 +1381,58 @@
     <w:pPr>
       <w:pStyle w:val="af3"/>
       <w:rPr>
-        <w:lang w:val="en-US"/>
-      </w:rPr>
-    </w:pPr>
-    <w:r>
-      <w:rPr>
         <w:sz w:val="16"/>
         <w:szCs w:val="16"/>
         <w:lang w:val="en-US"/>
       </w:rPr>
-      <w:t>{</w:t>
-    </w:r>
-    <w:proofErr w:type="spellStart"/>
+    </w:pPr>
     <w:r>
       <w:rPr>
         <w:sz w:val="16"/>
         <w:szCs w:val="16"/>
-        <w:lang w:val="en-US"/>
-      </w:rPr>
-      <w:t>data_field</w:t>
+      </w:rPr>
+      <w:t>2</w:t>
     </w:r>
-    <w:proofErr w:type="spellEnd"/>
     <w:r>
       <w:rPr>
         <w:sz w:val="16"/>
         <w:szCs w:val="16"/>
-        <w:lang w:val="en-US"/>
-      </w:rPr>
-      <w:t>}</w:t>
+      </w:rPr>
+      <w:t>6</w:t>
     </w:r>
+    <w:r>
+      <w:rPr>
+        <w:sz w:val="16"/>
+        <w:szCs w:val="16"/>
+      </w:rPr>
+      <w:t>.</w:t>
+    </w:r>
+    <w:r>
+      <w:rPr>
+        <w:sz w:val="16"/>
+        <w:szCs w:val="16"/>
+      </w:rPr>
+      <w:t>03</w:t>
+    </w:r>
+    <w:r>
+      <w:rPr>
+        <w:sz w:val="16"/>
+        <w:szCs w:val="16"/>
+      </w:rPr>
+      <w:t>.202</w:t>
+    </w:r>
+    <w:r>
+      <w:rPr>
+        <w:sz w:val="16"/>
+        <w:szCs w:val="16"/>
+      </w:rPr>
+      <w:t>5</w:t>
+    </w:r>
+  </w:p>
+  <w:p>
+    <w:pPr>
+      <w:pStyle w:val="af3"/>
+    </w:pPr>
   </w:p>
 </w:ftr>
 </file>
@@ -1596,30 +1457,30 @@
 </file>
 
 <file path=word/header1.xml><?xml version="1.0" encoding="utf-8"?>
-<w:hdr xmlns:wpc="http://schemas.microsoft.com/office/word/2010/wordprocessingCanvas" xmlns:cx="http://schemas.microsoft.com/office/drawing/2014/chartex" xmlns:cx1="http://schemas.microsoft.com/office/drawing/2015/9/8/chartex" xmlns:cx2="http://schemas.microsoft.com/office/drawing/2015/10/21/chartex" xmlns:cx3="http://schemas.microsoft.com/office/drawing/2016/5/9/chartex" xmlns:cx4="http://schemas.microsoft.com/office/drawing/2016/5/10/chartex" xmlns:cx5="http://schemas.microsoft.com/office/drawing/2016/5/11/chartex" xmlns:cx6="http://schemas.microsoft.com/office/drawing/2016/5/12/chartex" xmlns:cx7="http://schemas.microsoft.com/office/drawing/2016/5/13/chartex" xmlns:cx8="http://schemas.microsoft.com/office/drawing/2016/5/14/chartex" xmlns:mc="http://schemas.openxmlformats.org/markup-compatibility/2006" xmlns:aink="http://schemas.microsoft.com/office/drawing/2016/ink" xmlns:am3d="http://schemas.microsoft.com/office/drawing/2017/model3d" xmlns:o="urn:schemas-microsoft-com:office:office" xmlns:oel="http://schemas.microsoft.com/office/2019/extlst" xmlns:r="http://schemas.openxmlformats.org/officeDocument/2006/relationships" xmlns:m="http://schemas.openxmlformats.org/officeDocument/2006/math" xmlns:v="urn:schemas-microsoft-com:vml" xmlns:wp14="http://schemas.microsoft.com/office/word/2010/wordprocessingDrawing" xmlns:wp="http://schemas.openxmlformats.org/drawingml/2006/wordprocessingDrawing" xmlns:w10="urn:schemas-microsoft-com:office:word" xmlns:w="http://schemas.openxmlformats.org/wordprocessingml/2006/main" xmlns:w14="http://schemas.microsoft.com/office/word/2010/wordml" xmlns:w15="http://schemas.microsoft.com/office/word/2012/wordml" xmlns:w16cex="http://schemas.microsoft.com/office/word/2018/wordml/cex" xmlns:w16cid="http://schemas.microsoft.com/office/word/2016/wordml/cid" xmlns:w16="http://schemas.microsoft.com/office/word/2018/wordml" xmlns:w16du="http://schemas.microsoft.com/office/word/2023/wordml/word16du" xmlns:w16sdtdh="http://schemas.microsoft.com/office/word/2020/wordml/sdtdatahash" xmlns:w16sdtfl="http://schemas.microsoft.com/office/word/2024/wordml/sdtformatlock" xmlns:w16se="http://schemas.microsoft.com/office/word/2015/wordml/symex" xmlns:wpg="http://schemas.microsoft.com/office/word/2010/wordprocessingGroup" xmlns:wpi="http://schemas.microsoft.com/office/word/2010/wordprocessingInk" xmlns:wne="http://schemas.microsoft.com/office/word/2006/wordml" xmlns:wps="http://schemas.microsoft.com/office/word/2010/wordprocessingShape" mc:Ignorable="w14 w15 w16se w16cid w16 w16cex w16sdtdh w16sdtfl w16du wp14">
+<w:hdr xmlns:m="http://schemas.openxmlformats.org/officeDocument/2006/math" xmlns:mc="http://schemas.openxmlformats.org/markup-compatibility/2006" xmlns:mo="http://schemas.microsoft.com/office/mac/office/2008/main" xmlns:mv="urn:schemas-microsoft-com:mac:vml" xmlns:o="urn:schemas-microsoft-com:office:office" xmlns:r="http://schemas.openxmlformats.org/officeDocument/2006/relationships" xmlns:v="urn:schemas-microsoft-com:vml" xmlns:w10="urn:schemas-microsoft-com:office:word" xmlns:w14="http://schemas.microsoft.com/office/word/2010/wordml" xmlns:w="http://schemas.openxmlformats.org/wordprocessingml/2006/main" xmlns:wne="http://schemas.microsoft.com/office/word/2006/wordml" xmlns:wp14="http://schemas.microsoft.com/office/word/2010/wordprocessingDrawing" xmlns:wp="http://schemas.openxmlformats.org/drawingml/2006/wordprocessingDrawing" xmlns:wpc="http://schemas.microsoft.com/office/word/2010/wordprocessingCanvas" xmlns:wpg="http://schemas.microsoft.com/office/word/2010/wordprocessingGroup" xmlns:wpi="http://schemas.microsoft.com/office/word/2010/wordprocessingInk" xmlns:wps="http://schemas.microsoft.com/office/word/2010/wordprocessingShape" mc:Ignorable="w14 wp14">
   <w:p>
     <w:pPr>
-      <w:pStyle w:val="af1"/>
+      <w:pStyle w:val="Header"/>
     </w:pPr>
   </w:p>
 </w:hdr>
 </file>
 
 <file path=word/header2.xml><?xml version="1.0" encoding="utf-8"?>
-<w:hdr xmlns:wpc="http://schemas.microsoft.com/office/word/2010/wordprocessingCanvas" xmlns:cx="http://schemas.microsoft.com/office/drawing/2014/chartex" xmlns:cx1="http://schemas.microsoft.com/office/drawing/2015/9/8/chartex" xmlns:cx2="http://schemas.microsoft.com/office/drawing/2015/10/21/chartex" xmlns:cx3="http://schemas.microsoft.com/office/drawing/2016/5/9/chartex" xmlns:cx4="http://schemas.microsoft.com/office/drawing/2016/5/10/chartex" xmlns:cx5="http://schemas.microsoft.com/office/drawing/2016/5/11/chartex" xmlns:cx6="http://schemas.microsoft.com/office/drawing/2016/5/12/chartex" xmlns:cx7="http://schemas.microsoft.com/office/drawing/2016/5/13/chartex" xmlns:cx8="http://schemas.microsoft.com/office/drawing/2016/5/14/chartex" xmlns:mc="http://schemas.openxmlformats.org/markup-compatibility/2006" xmlns:aink="http://schemas.microsoft.com/office/drawing/2016/ink" xmlns:am3d="http://schemas.microsoft.com/office/drawing/2017/model3d" xmlns:o="urn:schemas-microsoft-com:office:office" xmlns:oel="http://schemas.microsoft.com/office/2019/extlst" xmlns:r="http://schemas.openxmlformats.org/officeDocument/2006/relationships" xmlns:m="http://schemas.openxmlformats.org/officeDocument/2006/math" xmlns:v="urn:schemas-microsoft-com:vml" xmlns:wp14="http://schemas.microsoft.com/office/word/2010/wordprocessingDrawing" xmlns:wp="http://schemas.openxmlformats.org/drawingml/2006/wordprocessingDrawing" xmlns:w10="urn:schemas-microsoft-com:office:word" xmlns:w="http://schemas.openxmlformats.org/wordprocessingml/2006/main" xmlns:w14="http://schemas.microsoft.com/office/word/2010/wordml" xmlns:w15="http://schemas.microsoft.com/office/word/2012/wordml" xmlns:w16cex="http://schemas.microsoft.com/office/word/2018/wordml/cex" xmlns:w16cid="http://schemas.microsoft.com/office/word/2016/wordml/cid" xmlns:w16="http://schemas.microsoft.com/office/word/2018/wordml" xmlns:w16du="http://schemas.microsoft.com/office/word/2023/wordml/word16du" xmlns:w16sdtdh="http://schemas.microsoft.com/office/word/2020/wordml/sdtdatahash" xmlns:w16sdtfl="http://schemas.microsoft.com/office/word/2024/wordml/sdtformatlock" xmlns:w16se="http://schemas.microsoft.com/office/word/2015/wordml/symex" xmlns:wpg="http://schemas.microsoft.com/office/word/2010/wordprocessingGroup" xmlns:wpi="http://schemas.microsoft.com/office/word/2010/wordprocessingInk" xmlns:wne="http://schemas.microsoft.com/office/word/2006/wordml" xmlns:wps="http://schemas.microsoft.com/office/word/2010/wordprocessingShape" mc:Ignorable="w14 w15 w16se w16cid w16 w16cex w16sdtdh w16sdtfl w16du wp14">
+<w:hdr xmlns:m="http://schemas.openxmlformats.org/officeDocument/2006/math" xmlns:mc="http://schemas.openxmlformats.org/markup-compatibility/2006" xmlns:mo="http://schemas.microsoft.com/office/mac/office/2008/main" xmlns:mv="urn:schemas-microsoft-com:mac:vml" xmlns:o="urn:schemas-microsoft-com:office:office" xmlns:r="http://schemas.openxmlformats.org/officeDocument/2006/relationships" xmlns:v="urn:schemas-microsoft-com:vml" xmlns:w10="urn:schemas-microsoft-com:office:word" xmlns:w14="http://schemas.microsoft.com/office/word/2010/wordml" xmlns:w="http://schemas.openxmlformats.org/wordprocessingml/2006/main" xmlns:wne="http://schemas.microsoft.com/office/word/2006/wordml" xmlns:wp14="http://schemas.microsoft.com/office/word/2010/wordprocessingDrawing" xmlns:wp="http://schemas.openxmlformats.org/drawingml/2006/wordprocessingDrawing" xmlns:wpc="http://schemas.microsoft.com/office/word/2010/wordprocessingCanvas" xmlns:wpg="http://schemas.microsoft.com/office/word/2010/wordprocessingGroup" xmlns:wpi="http://schemas.microsoft.com/office/word/2010/wordprocessingInk" xmlns:wps="http://schemas.microsoft.com/office/word/2010/wordprocessingShape" mc:Ignorable="w14 wp14">
   <w:p>
     <w:pPr>
-      <w:pStyle w:val="af1"/>
+      <w:pStyle w:val="Header"/>
     </w:pPr>
   </w:p>
 </w:hdr>
 </file>
 
 <file path=word/header3.xml><?xml version="1.0" encoding="utf-8"?>
-<w:hdr xmlns:wpc="http://schemas.microsoft.com/office/word/2010/wordprocessingCanvas" xmlns:cx="http://schemas.microsoft.com/office/drawing/2014/chartex" xmlns:cx1="http://schemas.microsoft.com/office/drawing/2015/9/8/chartex" xmlns:cx2="http://schemas.microsoft.com/office/drawing/2015/10/21/chartex" xmlns:cx3="http://schemas.microsoft.com/office/drawing/2016/5/9/chartex" xmlns:cx4="http://schemas.microsoft.com/office/drawing/2016/5/10/chartex" xmlns:cx5="http://schemas.microsoft.com/office/drawing/2016/5/11/chartex" xmlns:cx6="http://schemas.microsoft.com/office/drawing/2016/5/12/chartex" xmlns:cx7="http://schemas.microsoft.com/office/drawing/2016/5/13/chartex" xmlns:cx8="http://schemas.microsoft.com/office/drawing/2016/5/14/chartex" xmlns:mc="http://schemas.openxmlformats.org/markup-compatibility/2006" xmlns:aink="http://schemas.microsoft.com/office/drawing/2016/ink" xmlns:am3d="http://schemas.microsoft.com/office/drawing/2017/model3d" xmlns:o="urn:schemas-microsoft-com:office:office" xmlns:oel="http://schemas.microsoft.com/office/2019/extlst" xmlns:r="http://schemas.openxmlformats.org/officeDocument/2006/relationships" xmlns:m="http://schemas.openxmlformats.org/officeDocument/2006/math" xmlns:v="urn:schemas-microsoft-com:vml" xmlns:wp14="http://schemas.microsoft.com/office/word/2010/wordprocessingDrawing" xmlns:wp="http://schemas.openxmlformats.org/drawingml/2006/wordprocessingDrawing" xmlns:w10="urn:schemas-microsoft-com:office:word" xmlns:w="http://schemas.openxmlformats.org/wordprocessingml/2006/main" xmlns:w14="http://schemas.microsoft.com/office/word/2010/wordml" xmlns:w15="http://schemas.microsoft.com/office/word/2012/wordml" xmlns:w16cex="http://schemas.microsoft.com/office/word/2018/wordml/cex" xmlns:w16cid="http://schemas.microsoft.com/office/word/2016/wordml/cid" xmlns:w16="http://schemas.microsoft.com/office/word/2018/wordml" xmlns:w16du="http://schemas.microsoft.com/office/word/2023/wordml/word16du" xmlns:w16sdtdh="http://schemas.microsoft.com/office/word/2020/wordml/sdtdatahash" xmlns:w16sdtfl="http://schemas.microsoft.com/office/word/2024/wordml/sdtformatlock" xmlns:w16se="http://schemas.microsoft.com/office/word/2015/wordml/symex" xmlns:wpg="http://schemas.microsoft.com/office/word/2010/wordprocessingGroup" xmlns:wpi="http://schemas.microsoft.com/office/word/2010/wordprocessingInk" xmlns:wne="http://schemas.microsoft.com/office/word/2006/wordml" xmlns:wps="http://schemas.microsoft.com/office/word/2010/wordprocessingShape" mc:Ignorable="w14 w15 w16se w16cid w16 w16cex w16sdtdh w16sdtfl w16du wp14">
+<w:hdr xmlns:m="http://schemas.openxmlformats.org/officeDocument/2006/math" xmlns:mc="http://schemas.openxmlformats.org/markup-compatibility/2006" xmlns:mo="http://schemas.microsoft.com/office/mac/office/2008/main" xmlns:mv="urn:schemas-microsoft-com:mac:vml" xmlns:o="urn:schemas-microsoft-com:office:office" xmlns:r="http://schemas.openxmlformats.org/officeDocument/2006/relationships" xmlns:v="urn:schemas-microsoft-com:vml" xmlns:w10="urn:schemas-microsoft-com:office:word" xmlns:w14="http://schemas.microsoft.com/office/word/2010/wordml" xmlns:w="http://schemas.openxmlformats.org/wordprocessingml/2006/main" xmlns:wne="http://schemas.microsoft.com/office/word/2006/wordml" xmlns:wp14="http://schemas.microsoft.com/office/word/2010/wordprocessingDrawing" xmlns:wp="http://schemas.openxmlformats.org/drawingml/2006/wordprocessingDrawing" xmlns:wpc="http://schemas.microsoft.com/office/word/2010/wordprocessingCanvas" xmlns:wpg="http://schemas.microsoft.com/office/word/2010/wordprocessingGroup" xmlns:wpi="http://schemas.microsoft.com/office/word/2010/wordprocessingInk" xmlns:wps="http://schemas.microsoft.com/office/word/2010/wordprocessingShape" mc:Ignorable="w14 wp14">
   <w:p>
     <w:pPr>
-      <w:pStyle w:val="af1"/>
+      <w:pStyle w:val="Header"/>
     </w:pPr>
   </w:p>
 </w:hdr>
@@ -3968,73 +3829,73 @@
       </w:rPr>
     </w:lvl>
   </w:abstractNum>
-  <w:num w:numId="1" w16cid:durableId="277378627">
+  <w:num w:numId="1" w16cid:durableId="1353799290">
     <w:abstractNumId w:val="4"/>
   </w:num>
-  <w:num w:numId="2" w16cid:durableId="945817619">
+  <w:num w:numId="2" w16cid:durableId="347289825">
     <w:abstractNumId w:val="15"/>
   </w:num>
-  <w:num w:numId="3" w16cid:durableId="1325015668">
+  <w:num w:numId="3" w16cid:durableId="1034232969">
     <w:abstractNumId w:val="3"/>
   </w:num>
-  <w:num w:numId="4" w16cid:durableId="260723583">
+  <w:num w:numId="4" w16cid:durableId="641737363">
     <w:abstractNumId w:val="2"/>
   </w:num>
-  <w:num w:numId="5" w16cid:durableId="1839812051">
+  <w:num w:numId="5" w16cid:durableId="1885826186">
     <w:abstractNumId w:val="5"/>
   </w:num>
-  <w:num w:numId="6" w16cid:durableId="1270626497">
+  <w:num w:numId="6" w16cid:durableId="817308494">
     <w:abstractNumId w:val="0"/>
   </w:num>
-  <w:num w:numId="7" w16cid:durableId="540552555">
+  <w:num w:numId="7" w16cid:durableId="429475496">
     <w:abstractNumId w:val="20"/>
   </w:num>
-  <w:num w:numId="8" w16cid:durableId="2025017218">
+  <w:num w:numId="8" w16cid:durableId="936328432">
     <w:abstractNumId w:val="19"/>
   </w:num>
-  <w:num w:numId="9" w16cid:durableId="893127539">
+  <w:num w:numId="9" w16cid:durableId="445776818">
     <w:abstractNumId w:val="17"/>
   </w:num>
-  <w:num w:numId="10" w16cid:durableId="1250308572">
+  <w:num w:numId="10" w16cid:durableId="567768537">
     <w:abstractNumId w:val="9"/>
   </w:num>
-  <w:num w:numId="11" w16cid:durableId="1899509718">
+  <w:num w:numId="11" w16cid:durableId="1989476801">
     <w:abstractNumId w:val="1"/>
   </w:num>
-  <w:num w:numId="12" w16cid:durableId="788478460">
+  <w:num w:numId="12" w16cid:durableId="1942252092">
     <w:abstractNumId w:val="11"/>
   </w:num>
-  <w:num w:numId="13" w16cid:durableId="801188658">
+  <w:num w:numId="13" w16cid:durableId="357506516">
     <w:abstractNumId w:val="12"/>
   </w:num>
-  <w:num w:numId="14" w16cid:durableId="1026255144">
+  <w:num w:numId="14" w16cid:durableId="786658592">
     <w:abstractNumId w:val="18"/>
   </w:num>
-  <w:num w:numId="15" w16cid:durableId="348024520">
+  <w:num w:numId="15" w16cid:durableId="1695576233">
     <w:abstractNumId w:val="8"/>
   </w:num>
-  <w:num w:numId="16" w16cid:durableId="1910531042">
+  <w:num w:numId="16" w16cid:durableId="583301804">
     <w:abstractNumId w:val="21"/>
   </w:num>
-  <w:num w:numId="17" w16cid:durableId="42488970">
+  <w:num w:numId="17" w16cid:durableId="82336708">
     <w:abstractNumId w:val="13"/>
   </w:num>
-  <w:num w:numId="18" w16cid:durableId="1108239352">
+  <w:num w:numId="18" w16cid:durableId="301008694">
     <w:abstractNumId w:val="14"/>
   </w:num>
-  <w:num w:numId="19" w16cid:durableId="246697506">
+  <w:num w:numId="19" w16cid:durableId="1746415344">
     <w:abstractNumId w:val="6"/>
   </w:num>
-  <w:num w:numId="20" w16cid:durableId="1180775504">
+  <w:num w:numId="20" w16cid:durableId="1581867962">
     <w:abstractNumId w:val="16"/>
   </w:num>
-  <w:num w:numId="21" w16cid:durableId="584729797">
+  <w:num w:numId="21" w16cid:durableId="828209722">
     <w:abstractNumId w:val="22"/>
   </w:num>
-  <w:num w:numId="22" w16cid:durableId="1458378453">
+  <w:num w:numId="22" w16cid:durableId="2041851612">
     <w:abstractNumId w:val="10"/>
   </w:num>
-  <w:num w:numId="23" w16cid:durableId="2010398738">
+  <w:num w:numId="23" w16cid:durableId="1547991380">
     <w:abstractNumId w:val="7"/>
   </w:num>
 </w:numbering>
@@ -4343,7 +4204,7 @@
   <w:style w:type="paragraph" w:default="1" w:styleId="a0">
     <w:name w:val="Normal"/>
     <w:qFormat/>
-    <w:rsid w:val="004407D4"/>
+    <w:rsid w:val="009C5228"/>
     <w:rPr>
       <w:rFonts w:eastAsia="Calibri"/>
       <w:color w:val="000000"/>
@@ -5005,7 +4866,7 @@
 </file>
 
 <file path=customXml/itemProps1.xml><?xml version="1.0" encoding="utf-8"?>
-<ds:datastoreItem xmlns:ds="http://schemas.openxmlformats.org/officeDocument/2006/customXml" ds:itemID="{26BC4671-E30F-4C45-8AD7-23FF7818C733}">
+<ds:datastoreItem xmlns:ds="http://schemas.openxmlformats.org/officeDocument/2006/customXml" ds:itemID="{8BCAD4C7-99D4-484D-B62B-A541A9617415}">
   <ds:schemaRefs>
     <ds:schemaRef ds:uri="http://schemas.openxmlformats.org/officeDocument/2006/bibliography"/>
   </ds:schemaRefs>

</xml_diff>

<commit_message>
feature/template 2 with table editing
</commit_message>
<xml_diff>
--- a/converted_files/template.docx
+++ b/converted_files/template.docx
@@ -280,7 +280,7 @@
                 <w:b/>
                 <w:bCs/>
               </w:rPr>
-              <w:t>Аоываыв А.А.</w:t>
+              <w:t>Иванов И.И.</w:t>
             </w:r>
             <w:r>
               <w:rPr>
@@ -374,6 +374,7 @@
               <w:jc w:val="center"/>
               <w:rPr>
                 <w:noProof/>
+                <w:lang w:val="en-US"/>
               </w:rPr>
             </w:pPr>
             <w:r>
@@ -381,7 +382,7 @@
                 <w:noProof/>
                 <w:lang w:val="en-US"/>
               </w:rPr>
-              <w:t>{contract_number}</w:t>
+              <w:t>{contract_field}</w:t>
             </w:r>
           </w:p>
         </w:tc>
@@ -608,7 +609,7 @@
         <w:rPr>
           <w:b/>
         </w:rPr>
-        <w:t>Уважаемый Аоываыв А.А.!</w:t>
+        <w:t>Уважаемый Иванов И.И.!</w:t>
       </w:r>
       <w:r>
         <w:rPr>
@@ -649,7 +650,7 @@
         <w:rPr>
           <w:color w:val="auto"/>
         </w:rPr>
-        <w:t>Представляю Вам рабочую документацию по проекту «Дооснащение подсистем котов в домашних условиях ООО «Мур мяу», разработанную в рамках договора подряда 3432423 от 2020-12-12, (далее – Рабочая документация) на электронном носителе согласно Приложению.</w:t>
+        <w:t>Представляю Вам рабочую документацию по проекту «Дооснащение подсистем котов в домашних условиях ООО «Мур мяу», разработанную в рамках договора подряда №РД-5870 от , (далее – Рабочая документация) на электронном носителе согласно Приложению.</w:t>
       </w:r>
       <w:r>
         <w:rPr>
@@ -1090,7 +1091,7 @@
               <w:rPr>
                 <w:lang w:val="en-US"/>
               </w:rPr>
-              <w:t>А. Б. Апвыа</w:t>
+              <w:t>В.Е. Кушнаренко</w:t>
             </w:r>
             <w:r>
               <w:rPr/>

</xml_diff>